<commit_message>
docx: fix table rendering and remove spurious TOC
The --- -> em-dash replacement was converting pipe table separator
rows |---|---|---| into |—|—|—| which pandoc couldn't parse as
tables, causing all 13 tables to render as raw pipe-delimited text
in Word. Removed the global --- replacement (pandoc's docx writer
handles em-dashes in prose natively). Also removed --toc flag since
J Cheminform doesn't require Table of Contents in Word submissions
and it was creating a spurious heading.

Verified: 14 w:tbl elements in word/document.xml (all 13 data
tables now render as proper Word tables), 107 OMML math blocks,
4 embedded PNG figures. Round-trip PDF shows Table 1 with clean
columns on page 7.

Co-Authored-By: Claude Opus 4.6 (1M context) <noreply@anthropic.com>
</commit_message>
<xml_diff>
--- a/docs/paper_final/manuscript.docx
+++ b/docs/paper_final/manuscript.docx
@@ -12,40 +12,24 @@
       <w:r>
         <w:t xml:space="preserve"> </w:t>
       </w:r>
-      <m:oMath>
-        <m:sSup>
-          <m:e>
-            <m:r>
-              <m:t>​</m:t>
-            </m:r>
-          </m:e>
-          <m:sup>
-            <m:r>
-              <m:t>1</m:t>
-            </m:r>
-          </m:sup>
-        </m:sSup>
-      </m:oMath>
+      <w:r>
+        <w:rPr>
+          <w:vertAlign w:val="superscript"/>
+        </w:rPr>
+        <w:t xml:space="preserve">1</w:t>
+      </w:r>
       <w:r>
         <w:t xml:space="preserve">H and</w:t>
       </w:r>
       <w:r>
         <w:t xml:space="preserve"> </w:t>
       </w:r>
-      <m:oMath>
-        <m:sSup>
-          <m:e>
-            <m:r>
-              <m:t>​</m:t>
-            </m:r>
-          </m:e>
-          <m:sup>
-            <m:r>
-              <m:t>13</m:t>
-            </m:r>
-          </m:sup>
-        </m:sSup>
-      </m:oMath>
+      <w:r>
+        <w:rPr>
+          <w:vertAlign w:val="superscript"/>
+        </w:rPr>
+        <w:t xml:space="preserve">13</w:t>
+      </w:r>
       <w:r>
         <w:t xml:space="preserve">C NMR chemical shifts jointly</w:t>
       </w:r>
@@ -54,6 +38,20 @@
       </w:r>
       <w:r>
         <w:t xml:space="preserve">from unassigned 2-D HSQC peak sets</w:t>
+      </w:r>
+    </w:p>
+    <w:p>
+      <w:pPr>
+        <w:pStyle w:val="Subtitle"/>
+      </w:pPr>
+      <w:r>
+        <w:t xml:space="preserve">A sliced sort-match weak-supervision recipe,</w:t>
+      </w:r>
+      <w:r>
+        <w:t xml:space="preserve"> </w:t>
+      </w:r>
+      <w:r>
+        <w:t xml:space="preserve">causally audited and calibrated for dereplication</w:t>
       </w:r>
     </w:p>
     <w:p>
@@ -62,6 +60,22 @@
       </w:pPr>
       <w:r>
         <w:t xml:space="preserve">April 2026</w:t>
+      </w:r>
+    </w:p>
+    <w:p>
+      <w:pPr>
+        <w:pStyle w:val="AbstractTitle"/>
+      </w:pPr>
+      <w:r>
+        <w:t xml:space="preserve">Abstract</w:t>
+      </w:r>
+    </w:p>
+    <w:p>
+      <w:pPr>
+        <w:pStyle w:val="Abstract"/>
+      </w:pPr>
+      <w:r>
+        <w:t xml:space="preserve">See structured abstract in the manuscript body.</w:t>
       </w:r>
     </w:p>
     <w:bookmarkStart w:id="9" w:name="abstract"/>
@@ -70,6 +84,15 @@
         <w:pStyle w:val="Heading1"/>
       </w:pPr>
       <w:r>
+        <w:rPr>
+          <w:rStyle w:val="SectionNumber"/>
+        </w:rPr>
+        <w:t xml:space="preserve">1</w:t>
+      </w:r>
+      <w:r>
+        <w:tab/>
+      </w:r>
+      <w:r>
         <w:t xml:space="preserve">Abstract</w:t>
       </w:r>
     </w:p>
@@ -1096,9 +1119,6 @@
           <m:t>K</m:t>
         </m:r>
         <m:r>
-          <m:t> </m:t>
-        </m:r>
-        <m:r>
           <m:t>n</m:t>
         </m:r>
         <m:r>
@@ -1354,9 +1374,6 @@
           <m:t>K</m:t>
         </m:r>
         <m:r>
-          <m:t> </m:t>
-        </m:r>
-        <m:r>
           <m:t>n</m:t>
         </m:r>
         <m:r>
@@ -1544,6 +1561,13 @@
       </w:r>
       <w:r>
         <w:t xml:space="preserve">natural-product dereplication; graph neural network.</w:t>
+      </w:r>
+    </w:p>
+    <w:p>
+      <w:r>
+        <w:pict>
+          <v:rect style="width:0;height:1.5pt" o:hralign="center" o:hrstd="t" o:hr="t"/>
+        </w:pict>
       </w:r>
     </w:p>
     <w:bookmarkEnd w:id="9"/>
@@ -1553,6 +1577,15 @@
         <w:pStyle w:val="Heading1"/>
       </w:pPr>
       <w:r>
+        <w:rPr>
+          <w:rStyle w:val="SectionNumber"/>
+        </w:rPr>
+        <w:t xml:space="preserve">2</w:t>
+      </w:r>
+      <w:r>
+        <w:tab/>
+      </w:r>
+      <w:r>
         <w:t xml:space="preserve">Background</w:t>
       </w:r>
     </w:p>
@@ -1860,6 +1893,15 @@
         <w:pStyle w:val="Heading2"/>
       </w:pPr>
       <w:r>
+        <w:rPr>
+          <w:rStyle w:val="SectionNumber"/>
+        </w:rPr>
+        <w:t xml:space="preserve">2.1</w:t>
+      </w:r>
+      <w:r>
+        <w:tab/>
+      </w:r>
+      <w:r>
         <w:t xml:space="preserve">Related work and contributions of this paper</w:t>
       </w:r>
     </w:p>
@@ -2452,9 +2494,6 @@
         </m:r>
         <m:r>
           <m:t>K</m:t>
-        </m:r>
-        <m:r>
-          <m:t> </m:t>
         </m:r>
         <m:r>
           <m:t>n</m:t>
@@ -3027,6 +3066,15 @@
         <w:pStyle w:val="Heading1"/>
       </w:pPr>
       <w:r>
+        <w:rPr>
+          <w:rStyle w:val="SectionNumber"/>
+        </w:rPr>
+        <w:t xml:space="preserve">3</w:t>
+      </w:r>
+      <w:r>
+        <w:tab/>
+      </w:r>
+      <w:r>
         <w:t xml:space="preserve">Methods</w:t>
       </w:r>
     </w:p>
@@ -3036,6 +3084,15 @@
         <w:pStyle w:val="Heading2"/>
       </w:pPr>
       <w:r>
+        <w:rPr>
+          <w:rStyle w:val="SectionNumber"/>
+        </w:rPr>
+        <w:t xml:space="preserve">3.1</w:t>
+      </w:r>
+      <w:r>
+        <w:tab/>
+      </w:r>
+      <w:r>
         <w:t xml:space="preserve">Set-valued NMR supervision</w:t>
       </w:r>
     </w:p>
@@ -3178,9 +3235,6 @@
             <m:sty m:val="p"/>
           </m:rPr>
           <m:t>,</m:t>
-        </m:r>
-        <m:r>
-          <m:t> </m:t>
         </m:r>
         <m:sSubSup>
           <m:e>
@@ -3732,6 +3786,15 @@
       <w:pPr>
         <w:pStyle w:val="Heading2"/>
       </w:pPr>
+      <w:r>
+        <w:rPr>
+          <w:rStyle w:val="SectionNumber"/>
+        </w:rPr>
+        <w:t xml:space="preserve">3.2</w:t>
+      </w:r>
+      <w:r>
+        <w:tab/>
+      </w:r>
       <w:r>
         <w:t xml:space="preserve">Sliced approximation</w:t>
       </w:r>
@@ -4891,6 +4954,15 @@
         <w:pStyle w:val="Heading2"/>
       </w:pPr>
       <w:r>
+        <w:rPr>
+          <w:rStyle w:val="SectionNumber"/>
+        </w:rPr>
+        <w:t xml:space="preserve">3.3</w:t>
+      </w:r>
+      <w:r>
+        <w:tab/>
+      </w:r>
+      <w:r>
         <w:t xml:space="preserve">Axis-aligned decomposition</w:t>
       </w:r>
     </w:p>
@@ -5150,6 +5222,15 @@
       <w:pPr>
         <w:pStyle w:val="Heading2"/>
       </w:pPr>
+      <w:r>
+        <w:rPr>
+          <w:rStyle w:val="SectionNumber"/>
+        </w:rPr>
+        <w:t xml:space="preserve">3.4</w:t>
+      </w:r>
+      <w:r>
+        <w:tab/>
+      </w:r>
       <w:r>
         <w:t xml:space="preserve">Full training objective</w:t>
       </w:r>
@@ -5884,6 +5965,15 @@
         <w:pStyle w:val="Heading1"/>
       </w:pPr>
       <w:r>
+        <w:rPr>
+          <w:rStyle w:val="SectionNumber"/>
+        </w:rPr>
+        <w:t xml:space="preserve">4</w:t>
+      </w:r>
+      <w:r>
+        <w:tab/>
+      </w:r>
+      <w:r>
         <w:t xml:space="preserve">Experimental details</w:t>
       </w:r>
     </w:p>
@@ -5892,6 +5982,15 @@
       <w:pPr>
         <w:pStyle w:val="Heading2"/>
       </w:pPr>
+      <w:r>
+        <w:rPr>
+          <w:rStyle w:val="SectionNumber"/>
+        </w:rPr>
+        <w:t xml:space="preserve">4.1</w:t>
+      </w:r>
+      <w:r>
+        <w:tab/>
+      </w:r>
       <w:r>
         <w:t xml:space="preserve">Dataset construction</w:t>
       </w:r>
@@ -6201,6 +6300,15 @@
         <w:pStyle w:val="Heading2"/>
       </w:pPr>
       <w:r>
+        <w:rPr>
+          <w:rStyle w:val="SectionNumber"/>
+        </w:rPr>
+        <w:t xml:space="preserve">4.2</w:t>
+      </w:r>
+      <w:r>
+        <w:tab/>
+      </w:r>
+      <w:r>
         <w:t xml:space="preserve">Model</w:t>
       </w:r>
     </w:p>
@@ -6301,6 +6409,15 @@
         <w:pStyle w:val="Heading2"/>
       </w:pPr>
       <w:r>
+        <w:rPr>
+          <w:rStyle w:val="SectionNumber"/>
+        </w:rPr>
+        <w:t xml:space="preserve">4.3</w:t>
+      </w:r>
+      <w:r>
+        <w:tab/>
+      </w:r>
+      <w:r>
         <w:t xml:space="preserve">Sliced sort-match loss</w:t>
       </w:r>
     </w:p>
@@ -6532,6 +6649,15 @@
         <w:pStyle w:val="Heading2"/>
       </w:pPr>
       <w:r>
+        <w:rPr>
+          <w:rStyle w:val="SectionNumber"/>
+        </w:rPr>
+        <w:t xml:space="preserve">4.4</w:t>
+      </w:r>
+      <w:r>
+        <w:tab/>
+      </w:r>
+      <w:r>
         <w:t xml:space="preserve">Training protocol</w:t>
       </w:r>
     </w:p>
@@ -6733,9 +6859,6 @@
         </m:r>
         <m:r>
           <m:t>K</m:t>
-        </m:r>
-        <m:r>
-          <m:t> </m:t>
         </m:r>
         <m:r>
           <m:t>n</m:t>
@@ -6782,6 +6905,15 @@
         <w:pStyle w:val="Heading2"/>
       </w:pPr>
       <w:r>
+        <w:rPr>
+          <w:rStyle w:val="SectionNumber"/>
+        </w:rPr>
+        <w:t xml:space="preserve">4.5</w:t>
+      </w:r>
+      <w:r>
+        <w:tab/>
+      </w:r>
+      <w:r>
         <w:t xml:space="preserve">Split-conformal calibration</w:t>
       </w:r>
     </w:p>
@@ -7330,6 +7462,15 @@
       <w:pPr>
         <w:pStyle w:val="Heading2"/>
       </w:pPr>
+      <w:r>
+        <w:rPr>
+          <w:rStyle w:val="SectionNumber"/>
+        </w:rPr>
+        <w:t xml:space="preserve">4.6</w:t>
+      </w:r>
+      <w:r>
+        <w:tab/>
+      </w:r>
       <w:r>
         <w:t xml:space="preserve">Structure-verification protocol</w:t>
       </w:r>
@@ -7606,6 +7747,15 @@
         <w:pStyle w:val="Heading1"/>
       </w:pPr>
       <w:r>
+        <w:rPr>
+          <w:rStyle w:val="SectionNumber"/>
+        </w:rPr>
+        <w:t xml:space="preserve">5</w:t>
+      </w:r>
+      <w:r>
+        <w:tab/>
+      </w:r>
+      <w:r>
         <w:t xml:space="preserve">Results</w:t>
       </w:r>
     </w:p>
@@ -7749,6 +7899,15 @@
       <w:pPr>
         <w:pStyle w:val="Heading2"/>
       </w:pPr>
+      <w:r>
+        <w:rPr>
+          <w:rStyle w:val="SectionNumber"/>
+        </w:rPr>
+        <w:t xml:space="preserve">5.1</w:t>
+      </w:r>
+      <w:r>
+        <w:tab/>
+      </w:r>
       <w:r>
         <w:t xml:space="preserve">Main result</w:t>
       </w:r>
@@ -8647,9 +8806,6 @@
           <m:t>∼</m:t>
         </m:r>
         <m:r>
-          <m:t>​</m:t>
-        </m:r>
-        <m:r>
           <m:t>15</m:t>
         </m:r>
         <m:r>
@@ -8794,9 +8950,6 @@
             <m:sty m:val="p"/>
           </m:rPr>
           <m:t>∼</m:t>
-        </m:r>
-        <m:r>
-          <m:t>​</m:t>
         </m:r>
         <m:sSup>
           <m:e>
@@ -9133,6 +9286,15 @@
       <w:pPr>
         <w:pStyle w:val="Heading2"/>
       </w:pPr>
+      <w:r>
+        <w:rPr>
+          <w:rStyle w:val="SectionNumber"/>
+        </w:rPr>
+        <w:t xml:space="preserve">5.2</w:t>
+      </w:r>
+      <w:r>
+        <w:tab/>
+      </w:r>
       <w:r>
         <w:t xml:space="preserve">Causal audit: the</w:t>
       </w:r>
@@ -10065,12 +10227,28 @@
         <w:t xml:space="preserve">and localizes the training signal at the HSQC target itself.</w:t>
       </w:r>
     </w:p>
+    <w:p>
+      <w:r>
+        <w:pict>
+          <v:rect style="width:0;height:1.5pt" o:hralign="center" o:hrstd="t" o:hr="t"/>
+        </w:pict>
+      </w:r>
+    </w:p>
     <w:bookmarkEnd w:id="31"/>
     <w:bookmarkStart w:id="32" w:name="Xb45ec17c08196ede24c9d3dd598216512ecb57b"/>
     <w:p>
       <w:pPr>
         <w:pStyle w:val="Heading2"/>
       </w:pPr>
+      <w:r>
+        <w:rPr>
+          <w:rStyle w:val="SectionNumber"/>
+        </w:rPr>
+        <w:t xml:space="preserve">5.3</w:t>
+      </w:r>
+      <w:r>
+        <w:tab/>
+      </w:r>
       <w:r>
         <w:t xml:space="preserve">Combined supervision and the full-label regime</w:t>
       </w:r>
@@ -10298,6 +10476,15 @@
         <w:pStyle w:val="Heading2"/>
       </w:pPr>
       <w:r>
+        <w:rPr>
+          <w:rStyle w:val="SectionNumber"/>
+        </w:rPr>
+        <w:t xml:space="preserve">5.4</w:t>
+      </w:r>
+      <w:r>
+        <w:tab/>
+      </w:r>
+      <w:r>
         <w:t xml:space="preserve">Label-efficiency curve</w:t>
       </w:r>
     </w:p>
@@ -10730,7 +10917,7 @@
           <wp:inline>
             <wp:extent cx="5334000" cy="2420751"/>
             <wp:effectExtent b="0" l="0" r="0" t="0"/>
-            <wp:docPr descr="Label-efficiency curve. (a) ^{13}C MAE as a function of the ^{13}C-labelled fraction. Supervised-1-D (blue dashed) is useless below 10\% labels; 2-D SSL (green solid) remains within 6 ppm across the entire range and tracks supervised-1-D above 50\% labels. (b) ^{1}H MAE. Supervised-1-D is pinned at the random floor (\sim\!3 ppm) because its ^{1}H head receives no training signal; 2-D SSL delivers sub-0.45 ppm ^{1}H at every label fraction." title="" id="34" name="Picture"/>
+            <wp:docPr descr="Label-efficiency curve. (a) ^{13}C MAE as a function of the ^{13}C-labelled fraction. Supervised-1-D (blue dashed) is useless below 10\% labels; 2-D SSL (green solid) remains within 6 ppm across the entire range and tracks supervised-1-D above 50\% labels. (b) ^{1}H MAE. Supervised-1-D is pinned at the random floor (\sim3 ppm) because its ^{1}H head receives no training signal; 2-D SSL delivers sub-0.45 ppm ^{1}H at every label fraction." title="" id="34" name="Picture"/>
             <a:graphic>
               <a:graphicData uri="http://schemas.openxmlformats.org/drawingml/2006/picture">
                 <pic:pic>
@@ -10907,9 +11094,6 @@
           <m:t>∼</m:t>
         </m:r>
         <m:r>
-          <m:t>​</m:t>
-        </m:r>
-        <m:r>
           <m:t>3</m:t>
         </m:r>
       </m:oMath>
@@ -10972,6 +11156,15 @@
       <w:pPr>
         <w:pStyle w:val="Heading2"/>
       </w:pPr>
+      <w:r>
+        <w:rPr>
+          <w:rStyle w:val="SectionNumber"/>
+        </w:rPr>
+        <w:t xml:space="preserve">5.5</w:t>
+      </w:r>
+      <w:r>
+        <w:tab/>
+      </w:r>
       <w:r>
         <w:t xml:space="preserve">Wrong-candidate discrimination and the dereplication ranker</w:t>
       </w:r>
@@ -11481,6 +11674,13 @@
       </w:tr>
     </w:tbl>
     <w:p>
+      <w:r>
+        <w:pict>
+          <v:rect style="width:0;height:1.5pt" o:hralign="center" o:hrstd="t" o:hr="t"/>
+        </w:pict>
+      </w:r>
+    </w:p>
+    <w:p>
       <w:pPr>
         <w:pStyle w:val="CaptionedFigure"/>
       </w:pPr>
@@ -11532,7 +11732,17 @@
         <w:pStyle w:val="ImageCaption"/>
       </w:pPr>
       <w:r>
-        <w:t xml:space="preserve">Figure 4. Joint pass rates on the three wrong-candidate controls. Green bars are the joint pass rate for the correct structure; red bars are the joint pass rate for the wrong candidate. Numbers above each group are the correct-to-wrong discrimination ratio. The constitutional isomer control (same molecular formula, different connectivity) is the chemistry-meaningful number for natural-product dereplication.</w:t>
+        <w:rPr>
+          <w:b/>
+          <w:bCs/>
+        </w:rPr>
+        <w:t xml:space="preserve">Figure 4. Joint pass rates on the three wrong-candidate controls.</w:t>
+      </w:r>
+      <w:r>
+        <w:t xml:space="preserve"> </w:t>
+      </w:r>
+      <w:r>
+        <w:t xml:space="preserve">Green bars are the joint pass rate for the correct structure; red bars are the joint pass rate for the wrong candidate. Numbers above each group are the correct-to-wrong discrimination ratio. The constitutional isomer control (same molecular formula, different connectivity) is the chemistry-meaningful number for natural-product dereplication.</w:t>
       </w:r>
     </w:p>
     <w:p>
@@ -11605,6 +11815,15 @@
       <w:pPr>
         <w:pStyle w:val="Heading2"/>
       </w:pPr>
+      <w:r>
+        <w:rPr>
+          <w:rStyle w:val="SectionNumber"/>
+        </w:rPr>
+        <w:t xml:space="preserve">5.6</w:t>
+      </w:r>
+      <w:r>
+        <w:tab/>
+      </w:r>
       <w:r>
         <w:t xml:space="preserve">Scaffold-OOD generalization</w:t>
       </w:r>
@@ -12059,6 +12278,15 @@
         <w:pStyle w:val="Heading2"/>
       </w:pPr>
       <w:r>
+        <w:rPr>
+          <w:rStyle w:val="SectionNumber"/>
+        </w:rPr>
+        <w:t xml:space="preserve">5.7</w:t>
+      </w:r>
+      <w:r>
+        <w:tab/>
+      </w:r>
+      <w:r>
         <w:t xml:space="preserve">Robustness to realistic HSQC degradation</w:t>
       </w:r>
     </w:p>
@@ -12710,12 +12938,28 @@
         <w:t xml:space="preserve">literature-grade noise is unlikely to be the binding constraint.</w:t>
       </w:r>
     </w:p>
+    <w:p>
+      <w:r>
+        <w:pict>
+          <v:rect style="width:0;height:1.5pt" o:hralign="center" o:hrstd="t" o:hr="t"/>
+        </w:pict>
+      </w:r>
+    </w:p>
     <w:bookmarkEnd w:id="42"/>
     <w:bookmarkStart w:id="43" w:name="Xb85cc4a43ac94b71dda961d850c52be0dfe80ad"/>
     <w:p>
       <w:pPr>
         <w:pStyle w:val="Heading2"/>
       </w:pPr>
+      <w:r>
+        <w:rPr>
+          <w:rStyle w:val="SectionNumber"/>
+        </w:rPr>
+        <w:t xml:space="preserve">5.8</w:t>
+      </w:r>
+      <w:r>
+        <w:tab/>
+      </w:r>
       <w:r>
         <w:t xml:space="preserve">Hyperparameter sensitivity (</w:t>
       </w:r>
@@ -13695,6 +13939,15 @@
       <w:pPr>
         <w:pStyle w:val="Heading2"/>
       </w:pPr>
+      <w:r>
+        <w:rPr>
+          <w:rStyle w:val="SectionNumber"/>
+        </w:rPr>
+        <w:t xml:space="preserve">5.9</w:t>
+      </w:r>
+      <w:r>
+        <w:tab/>
+      </w:r>
       <w:r>
         <w:t xml:space="preserve">Per-carbon-type error decomposition</w:t>
       </w:r>
@@ -14348,6 +14601,15 @@
       <w:pPr>
         <w:pStyle w:val="Heading2"/>
       </w:pPr>
+      <w:r>
+        <w:rPr>
+          <w:rStyle w:val="SectionNumber"/>
+        </w:rPr>
+        <w:t xml:space="preserve">5.10</w:t>
+      </w:r>
+      <w:r>
+        <w:tab/>
+      </w:r>
       <w:r>
         <w:t xml:space="preserve">Split-conformal calibration and the molecule-level coverage question</w:t>
       </w:r>
@@ -15687,6 +15949,15 @@
         <w:pStyle w:val="Heading1"/>
       </w:pPr>
       <w:r>
+        <w:rPr>
+          <w:rStyle w:val="SectionNumber"/>
+        </w:rPr>
+        <w:t xml:space="preserve">6</w:t>
+      </w:r>
+      <w:r>
+        <w:tab/>
+      </w:r>
+      <w:r>
         <w:t xml:space="preserve">Discussion</w:t>
       </w:r>
     </w:p>
@@ -15695,6 +15966,15 @@
       <w:pPr>
         <w:pStyle w:val="Heading2"/>
       </w:pPr>
+      <w:r>
+        <w:rPr>
+          <w:rStyle w:val="SectionNumber"/>
+        </w:rPr>
+        <w:t xml:space="preserve">6.1</w:t>
+      </w:r>
+      <w:r>
+        <w:tab/>
+      </w:r>
       <w:r>
         <w:t xml:space="preserve">What the results actually show</w:t>
       </w:r>
@@ -15860,6 +16140,15 @@
         <w:pStyle w:val="Heading2"/>
       </w:pPr>
       <w:r>
+        <w:rPr>
+          <w:rStyle w:val="SectionNumber"/>
+        </w:rPr>
+        <w:t xml:space="preserve">6.2</w:t>
+      </w:r>
+      <w:r>
+        <w:tab/>
+      </w:r>
+      <w:r>
         <w:t xml:space="preserve">Honest reframing of the 2-D structure</w:t>
       </w:r>
     </w:p>
@@ -16087,6 +16376,15 @@
       <w:pPr>
         <w:pStyle w:val="Heading2"/>
       </w:pPr>
+      <w:r>
+        <w:rPr>
+          <w:rStyle w:val="SectionNumber"/>
+        </w:rPr>
+        <w:t xml:space="preserve">6.3</w:t>
+      </w:r>
+      <w:r>
+        <w:tab/>
+      </w:r>
       <w:r>
         <w:t xml:space="preserve">Limitations</w:t>
       </w:r>
@@ -16367,9 +16665,6 @@
           <m:t>∼</m:t>
         </m:r>
         <m:r>
-          <m:t>​</m:t>
-        </m:r>
-        <m:r>
           <m:t>15</m:t>
         </m:r>
         <m:r>
@@ -16845,6 +17140,15 @@
         <w:pStyle w:val="Heading2"/>
       </w:pPr>
       <w:r>
+        <w:rPr>
+          <w:rStyle w:val="SectionNumber"/>
+        </w:rPr>
+        <w:t xml:space="preserve">6.4</w:t>
+      </w:r>
+      <w:r>
+        <w:tab/>
+      </w:r>
+      <w:r>
         <w:t xml:space="preserve">Where this sits in the landscape</w:t>
       </w:r>
     </w:p>
@@ -17015,6 +17319,15 @@
         <w:pStyle w:val="Heading1"/>
       </w:pPr>
       <w:r>
+        <w:rPr>
+          <w:rStyle w:val="SectionNumber"/>
+        </w:rPr>
+        <w:t xml:space="preserve">7</w:t>
+      </w:r>
+      <w:r>
+        <w:tab/>
+      </w:r>
+      <w:r>
         <w:t xml:space="preserve">Conclusions</w:t>
       </w:r>
     </w:p>
@@ -17434,9 +17747,6 @@
         </m:r>
         <m:r>
           <m:t>K</m:t>
-        </m:r>
-        <m:r>
-          <m:t> </m:t>
         </m:r>
         <m:r>
           <m:t>n</m:t>
@@ -17759,6 +18069,15 @@
         <w:pStyle w:val="Heading1"/>
       </w:pPr>
       <w:r>
+        <w:rPr>
+          <w:rStyle w:val="SectionNumber"/>
+        </w:rPr>
+        <w:t xml:space="preserve">8</w:t>
+      </w:r>
+      <w:r>
+        <w:tab/>
+      </w:r>
+      <w:r>
         <w:t xml:space="preserve">Declarations</w:t>
       </w:r>
     </w:p>
@@ -17767,6 +18086,15 @@
       <w:pPr>
         <w:pStyle w:val="Heading2"/>
       </w:pPr>
+      <w:r>
+        <w:rPr>
+          <w:rStyle w:val="SectionNumber"/>
+        </w:rPr>
+        <w:t xml:space="preserve">8.1</w:t>
+      </w:r>
+      <w:r>
+        <w:tab/>
+      </w:r>
       <w:r>
         <w:t xml:space="preserve">Availability of data and materials</w:t>
       </w:r>
@@ -17889,6 +18217,15 @@
         <w:pStyle w:val="Heading2"/>
       </w:pPr>
       <w:r>
+        <w:rPr>
+          <w:rStyle w:val="SectionNumber"/>
+        </w:rPr>
+        <w:t xml:space="preserve">8.2</w:t>
+      </w:r>
+      <w:r>
+        <w:tab/>
+      </w:r>
+      <w:r>
         <w:t xml:space="preserve">Code availability</w:t>
       </w:r>
     </w:p>
@@ -18108,6 +18445,15 @@
         <w:pStyle w:val="Heading2"/>
       </w:pPr>
       <w:r>
+        <w:rPr>
+          <w:rStyle w:val="SectionNumber"/>
+        </w:rPr>
+        <w:t xml:space="preserve">8.3</w:t>
+      </w:r>
+      <w:r>
+        <w:tab/>
+      </w:r>
+      <w:r>
         <w:t xml:space="preserve">Abbreviations</w:t>
       </w:r>
     </w:p>
@@ -18150,6 +18496,15 @@
         <w:pStyle w:val="Heading2"/>
       </w:pPr>
       <w:r>
+        <w:rPr>
+          <w:rStyle w:val="SectionNumber"/>
+        </w:rPr>
+        <w:t xml:space="preserve">8.4</w:t>
+      </w:r>
+      <w:r>
+        <w:tab/>
+      </w:r>
+      <w:r>
         <w:t xml:space="preserve">Competing interests</w:t>
       </w:r>
     </w:p>
@@ -18168,6 +18523,15 @@
         <w:pStyle w:val="Heading2"/>
       </w:pPr>
       <w:r>
+        <w:rPr>
+          <w:rStyle w:val="SectionNumber"/>
+        </w:rPr>
+        <w:t xml:space="preserve">8.5</w:t>
+      </w:r>
+      <w:r>
+        <w:tab/>
+      </w:r>
+      <w:r>
         <w:t xml:space="preserve">Funding</w:t>
       </w:r>
     </w:p>
@@ -18186,6 +18550,15 @@
         <w:pStyle w:val="Heading2"/>
       </w:pPr>
       <w:r>
+        <w:rPr>
+          <w:rStyle w:val="SectionNumber"/>
+        </w:rPr>
+        <w:t xml:space="preserve">8.6</w:t>
+      </w:r>
+      <w:r>
+        <w:tab/>
+      </w:r>
+      <w:r>
         <w:t xml:space="preserve">Authors’ contributions</w:t>
       </w:r>
     </w:p>
@@ -18228,6 +18601,15 @@
         <w:pStyle w:val="Heading2"/>
       </w:pPr>
       <w:r>
+        <w:rPr>
+          <w:rStyle w:val="SectionNumber"/>
+        </w:rPr>
+        <w:t xml:space="preserve">8.7</w:t>
+      </w:r>
+      <w:r>
+        <w:tab/>
+      </w:r>
+      <w:r>
         <w:t xml:space="preserve">Acknowledgements</w:t>
       </w:r>
     </w:p>
@@ -18334,6 +18716,15 @@
         <w:pStyle w:val="Heading2"/>
       </w:pPr>
       <w:r>
+        <w:rPr>
+          <w:rStyle w:val="SectionNumber"/>
+        </w:rPr>
+        <w:t xml:space="preserve">8.8</w:t>
+      </w:r>
+      <w:r>
+        <w:tab/>
+      </w:r>
+      <w:r>
         <w:t xml:space="preserve">Ethics approval and consent to participate</w:t>
       </w:r>
     </w:p>
@@ -18363,6 +18754,15 @@
       <w:pPr>
         <w:pStyle w:val="Heading2"/>
       </w:pPr>
+      <w:r>
+        <w:rPr>
+          <w:rStyle w:val="SectionNumber"/>
+        </w:rPr>
+        <w:t xml:space="preserve">8.9</w:t>
+      </w:r>
+      <w:r>
+        <w:tab/>
+      </w:r>
       <w:r>
         <w:t xml:space="preserve">Consent for publication</w:t>
       </w:r>
@@ -18383,6 +18783,15 @@
         <w:pStyle w:val="Heading1"/>
       </w:pPr>
       <w:r>
+        <w:rPr>
+          <w:rStyle w:val="SectionNumber"/>
+        </w:rPr>
+        <w:t xml:space="preserve">9</w:t>
+      </w:r>
+      <w:r>
+        <w:tab/>
+      </w:r>
+      <w:r>
         <w:t xml:space="preserve">References</w:t>
       </w:r>
     </w:p>
@@ -18409,13 +18818,17 @@
         <w:t xml:space="preserve"> </w:t>
       </w:r>
       <w:r>
-        <w:t xml:space="preserve"> </w:t>
-      </w:r>
-      <w:r>
-        <w:t xml:space="preserve">5:292–300.</w:t>
-      </w:r>
-      <w:r>
-        <w:t xml:space="preserve"> </w:t>
+        <w:rPr>
+          <w:i/>
+          <w:iCs/>
+        </w:rPr>
+        <w:t xml:space="preserve">Nat Comput Sci</w:t>
+      </w:r>
+      <w:r>
+        <w:t xml:space="preserve"> </w:t>
+      </w:r>
+      <w:r>
+        <w:t xml:space="preserve">5:292–300. https://doi.org/10.1038/s43588-025-00783-z</w:t>
       </w:r>
     </w:p>
     <w:p>
@@ -18441,6 +18854,12 @@
         <w:t xml:space="preserve"> </w:t>
       </w:r>
       <w:r>
+        <w:rPr>
+          <w:rStyle w:val="VerbatimChar"/>
+        </w:rPr>
+        <w:t xml:space="preserve">v2.0-jin-revision</w:t>
+      </w:r>
+      <w:r>
         <w:t xml:space="preserve"> </w:t>
       </w:r>
       <w:r>
@@ -18450,6 +18869,9 @@
         <w:t xml:space="preserve"> </w:t>
       </w:r>
       <w:r>
+        <w:t xml:space="preserve">https://github.com/dongzhaohe321418-lab/nmr-ssl/releases/tag/v2.0-jin-revision</w:t>
+      </w:r>
+      <w:r>
         <w:t xml:space="preserve"> </w:t>
       </w:r>
       <w:r>
@@ -18463,6 +18885,13 @@
       </w:r>
       <w:r>
         <w:t xml:space="preserve"> </w:t>
+      </w:r>
+      <w:r>
+        <w:rPr>
+          <w:b/>
+          <w:bCs/>
+        </w:rPr>
+        <w:t xml:space="preserve">S8</w:t>
       </w:r>
       <w:r>
         <w:t xml:space="preserve"> </w:t>
@@ -18488,13 +18917,17 @@
         <w:t xml:space="preserve"> </w:t>
       </w:r>
       <w:r>
-        <w:t xml:space="preserve"> </w:t>
-      </w:r>
-      <w:r>
-        <w:t xml:space="preserve">51:22–45.</w:t>
-      </w:r>
-      <w:r>
-        <w:t xml:space="preserve"> </w:t>
+        <w:rPr>
+          <w:i/>
+          <w:iCs/>
+        </w:rPr>
+        <w:t xml:space="preserve">J Math Imaging Vis</w:t>
+      </w:r>
+      <w:r>
+        <w:t xml:space="preserve"> </w:t>
+      </w:r>
+      <w:r>
+        <w:t xml:space="preserve">51:22–45. https://doi.org/10.1007/s10851-014-0506-3</w:t>
       </w:r>
     </w:p>
     <w:p>
@@ -18508,10 +18941,34 @@
         <w:t xml:space="preserve"> </w:t>
       </w:r>
       <w:r>
+        <w:rPr>
+          <w:i/>
+          <w:iCs/>
+        </w:rPr>
+        <w:t xml:space="preserve">Algorithmic Learning</w:t>
+      </w:r>
+      <w:r>
+        <w:rPr>
+          <w:i/>
+          <w:iCs/>
+        </w:rPr>
+        <w:t xml:space="preserve"> </w:t>
+      </w:r>
+      <w:r>
+        <w:rPr>
+          <w:i/>
+          <w:iCs/>
+        </w:rPr>
+        <w:t xml:space="preserve">in a Random World</w:t>
+      </w:r>
+      <w:r>
         <w:t xml:space="preserve">. Springer, New York.</w:t>
       </w:r>
       <w:r>
         <w:t xml:space="preserve"> </w:t>
+      </w:r>
+      <w:r>
+        <w:t xml:space="preserve">https://doi.org/10.1007/b106715</w:t>
       </w:r>
     </w:p>
     <w:p>
@@ -18531,6 +18988,13 @@
         <w:t xml:space="preserve"> </w:t>
       </w:r>
       <w:r>
+        <w:rPr>
+          <w:i/>
+          <w:iCs/>
+        </w:rPr>
+        <w:t xml:space="preserve">J Am Stat Assoc</w:t>
+      </w:r>
+      <w:r>
         <w:t xml:space="preserve"> </w:t>
       </w:r>
       <w:r>
@@ -18538,6 +19002,9 @@
       </w:r>
       <w:r>
         <w:t xml:space="preserve"> </w:t>
+      </w:r>
+      <w:r>
+        <w:t xml:space="preserve">https://doi.org/10.1080/01621459.2017.1307116</w:t>
       </w:r>
     </w:p>
     <w:p>
@@ -18551,6 +19018,13 @@
         <w:t xml:space="preserve"> </w:t>
       </w:r>
       <w:r>
+        <w:rPr>
+          <w:i/>
+          <w:iCs/>
+        </w:rPr>
+        <w:t xml:space="preserve">Inequalities</w:t>
+      </w:r>
+      <w:r>
         <w:t xml:space="preserve">.</w:t>
       </w:r>
       <w:r>
@@ -18577,10 +19051,34 @@
         <w:t xml:space="preserve"> </w:t>
       </w:r>
       <w:r>
+        <w:rPr>
+          <w:i/>
+          <w:iCs/>
+        </w:rPr>
+        <w:t xml:space="preserve">Proceedings of the International</w:t>
+      </w:r>
+      <w:r>
+        <w:rPr>
+          <w:i/>
+          <w:iCs/>
+        </w:rPr>
+        <w:t xml:space="preserve"> </w:t>
+      </w:r>
+      <w:r>
+        <w:rPr>
+          <w:i/>
+          <w:iCs/>
+        </w:rPr>
+        <w:t xml:space="preserve">Conference on Learning Representations (ICLR)</w:t>
+      </w:r>
+      <w:r>
         <w:t xml:space="preserve">.</w:t>
       </w:r>
       <w:r>
         <w:t xml:space="preserve"> </w:t>
+      </w:r>
+      <w:r>
+        <w:t xml:space="preserve">https://arxiv.org/abs/1810.00826</w:t>
       </w:r>
     </w:p>
     <w:p>
@@ -18594,7 +19092,7 @@
         <w:t xml:space="preserve"> </w:t>
       </w:r>
       <w:r>
-        <w:t xml:space="preserve">. Accessed 15 Mar 2026.</w:t>
+        <w:t xml:space="preserve">https://www.rdkit.org. Accessed 15 Mar 2026.</w:t>
       </w:r>
     </w:p>
     <w:p>
@@ -18626,6 +19124,13 @@
         <w:t xml:space="preserve"> </w:t>
       </w:r>
       <w:r>
+        <w:rPr>
+          <w:i/>
+          <w:iCs/>
+        </w:rPr>
+        <w:t xml:space="preserve">Magn Reson Chem</w:t>
+      </w:r>
+      <w:r>
         <w:t xml:space="preserve"> </w:t>
       </w:r>
       <w:r>
@@ -18633,6 +19138,9 @@
       </w:r>
       <w:r>
         <w:t xml:space="preserve"> </w:t>
+      </w:r>
+      <w:r>
+        <w:t xml:space="preserve">https://doi.org/10.1002/mrc.4263</w:t>
       </w:r>
     </w:p>
     <w:p>
@@ -18658,6 +19166,27 @@
         <w:t xml:space="preserve"> </w:t>
       </w:r>
       <w:r>
+        <w:rPr>
+          <w:i/>
+          <w:iCs/>
+        </w:rPr>
+        <w:t xml:space="preserve">Advances in Neural Information</w:t>
+      </w:r>
+      <w:r>
+        <w:rPr>
+          <w:i/>
+          <w:iCs/>
+        </w:rPr>
+        <w:t xml:space="preserve"> </w:t>
+      </w:r>
+      <w:r>
+        <w:rPr>
+          <w:i/>
+          <w:iCs/>
+        </w:rPr>
+        <w:t xml:space="preserve">Processing Systems (NeurIPS)</w:t>
+      </w:r>
+      <w:r>
         <w:t xml:space="preserve"> </w:t>
       </w:r>
       <w:r>
@@ -18665,6 +19194,9 @@
       </w:r>
       <w:r>
         <w:t xml:space="preserve"> </w:t>
+      </w:r>
+      <w:r>
+        <w:t xml:space="preserve">https://arxiv.org/abs/1912.01703</w:t>
       </w:r>
     </w:p>
     <w:p>
@@ -18690,6 +19222,13 @@
         <w:t xml:space="preserve"> </w:t>
       </w:r>
       <w:r>
+        <w:rPr>
+          <w:i/>
+          <w:iCs/>
+        </w:rPr>
+        <w:t xml:space="preserve">arXiv preprint</w:t>
+      </w:r>
+      <w:r>
         <w:t xml:space="preserve"> </w:t>
       </w:r>
       <w:r>
@@ -18755,6 +19294,9 @@
       </w:r>
       <w:r>
         <w:t xml:space="preserve"> </w:t>
+      </w:r>
+      <w:r>
+        <w:t xml:space="preserve">https://arxiv.org/abs/2601.18524</w:t>
       </w:r>
     </w:p>
     <w:bookmarkEnd w:id="63"/>
@@ -18764,6 +19306,15 @@
         <w:pStyle w:val="Heading1"/>
       </w:pPr>
       <w:r>
+        <w:rPr>
+          <w:rStyle w:val="SectionNumber"/>
+        </w:rPr>
+        <w:t xml:space="preserve">10</w:t>
+      </w:r>
+      <w:r>
+        <w:tab/>
+      </w:r>
+      <w:r>
         <w:t xml:space="preserve">Supplementary Information</w:t>
       </w:r>
     </w:p>
@@ -18772,6 +19323,15 @@
       <w:pPr>
         <w:pStyle w:val="Heading2"/>
       </w:pPr>
+      <w:r>
+        <w:rPr>
+          <w:rStyle w:val="SectionNumber"/>
+        </w:rPr>
+        <w:t xml:space="preserve">10.1</w:t>
+      </w:r>
+      <w:r>
+        <w:tab/>
+      </w:r>
       <w:r>
         <w:t xml:space="preserve">S1. Per-seed results for the headline 2-D SSL variant</w:t>
       </w:r>
@@ -19149,6 +19709,15 @@
         <w:pStyle w:val="Heading2"/>
       </w:pPr>
       <w:r>
+        <w:rPr>
+          <w:rStyle w:val="SectionNumber"/>
+        </w:rPr>
+        <w:t xml:space="preserve">10.2</w:t>
+      </w:r>
+      <w:r>
+        <w:tab/>
+      </w:r>
+      <w:r>
         <w:t xml:space="preserve">S2. Per-seed results for the combined full-supervision variant</w:t>
       </w:r>
     </w:p>
@@ -19539,6 +20108,15 @@
         <w:pStyle w:val="Heading2"/>
       </w:pPr>
       <w:r>
+        <w:rPr>
+          <w:rStyle w:val="SectionNumber"/>
+        </w:rPr>
+        <w:t xml:space="preserve">10.3</w:t>
+      </w:r>
+      <w:r>
+        <w:tab/>
+      </w:r>
+      <w:r>
         <w:t xml:space="preserve">S3. Novel (and neutral) multiplicity-augmented loss</w:t>
       </w:r>
     </w:p>
@@ -20015,6 +20593,15 @@
         <w:pStyle w:val="Heading2"/>
       </w:pPr>
       <w:r>
+        <w:rPr>
+          <w:rStyle w:val="SectionNumber"/>
+        </w:rPr>
+        <w:t xml:space="preserve">10.4</w:t>
+      </w:r>
+      <w:r>
+        <w:tab/>
+      </w:r>
+      <w:r>
         <w:t xml:space="preserve">S4. Cross-task gradient isolation (stop-gradient control)</w:t>
       </w:r>
     </w:p>
@@ -20515,6 +21102,15 @@
       <w:pPr>
         <w:pStyle w:val="Heading2"/>
       </w:pPr>
+      <w:r>
+        <w:rPr>
+          <w:rStyle w:val="SectionNumber"/>
+        </w:rPr>
+        <w:t xml:space="preserve">10.5</w:t>
+      </w:r>
+      <w:r>
+        <w:tab/>
+      </w:r>
       <w:r>
         <w:t xml:space="preserve">S5. Pretrain-then-finetune transfer baseline</w:t>
       </w:r>
@@ -20978,6 +21574,15 @@
         <w:pStyle w:val="Heading2"/>
       </w:pPr>
       <w:r>
+        <w:rPr>
+          <w:rStyle w:val="SectionNumber"/>
+        </w:rPr>
+        <w:t xml:space="preserve">10.6</w:t>
+      </w:r>
+      <w:r>
+        <w:tab/>
+      </w:r>
+      <w:r>
         <w:t xml:space="preserve">S6. Stereo-rich natural-product stress test</w:t>
       </w:r>
     </w:p>
@@ -21143,6 +21748,15 @@
         <w:pStyle w:val="Heading2"/>
       </w:pPr>
       <w:r>
+        <w:rPr>
+          <w:rStyle w:val="SectionNumber"/>
+        </w:rPr>
+        <w:t xml:space="preserve">10.7</w:t>
+      </w:r>
+      <w:r>
+        <w:tab/>
+      </w:r>
+      <w:r>
         <w:t xml:space="preserve">S7. Loss-code audit</w:t>
       </w:r>
     </w:p>
@@ -21292,6 +21906,15 @@
       <w:pPr>
         <w:pStyle w:val="Heading2"/>
       </w:pPr>
+      <w:r>
+        <w:rPr>
+          <w:rStyle w:val="SectionNumber"/>
+        </w:rPr>
+        <w:t xml:space="preserve">10.8</w:t>
+      </w:r>
+      <w:r>
+        <w:tab/>
+      </w:r>
       <w:r>
         <w:t xml:space="preserve">S8. Self-contained statement and proof of the 1-D sort-match theorem</w:t>
       </w:r>
@@ -22727,9 +23350,6 @@
               </m:sSub>
             </m:e>
           </m:nary>
-          <m:r>
-            <m:t> </m:t>
-          </m:r>
           <m:sSub>
             <m:e>
               <m:r>
@@ -23141,9 +23761,6 @@
               </m:sSub>
             </m:e>
           </m:nary>
-          <m:r>
-            <m:t> </m:t>
-          </m:r>
           <m:sSub>
             <m:e>
               <m:r>
@@ -23230,9 +23847,6 @@
               </m:sSub>
             </m:e>
           </m:nary>
-          <m:r>
-            <m:t> </m:t>
-          </m:r>
           <m:sSub>
             <m:e>
               <m:r>
@@ -23460,9 +24074,6 @@
             </m:sSub>
           </m:e>
         </m:nary>
-        <m:r>
-          <m:t> </m:t>
-        </m:r>
         <m:sSub>
           <m:e>
             <m:r>
@@ -23879,9 +24490,6 @@
               </m:r>
             </m:lim>
           </m:limLow>
-          <m:r>
-            <m:t> </m:t>
-          </m:r>
           <m:nary>
             <m:naryPr>
               <m:chr m:val="∑"/>
@@ -23923,9 +24531,6 @@
               </m:sSub>
             </m:e>
           </m:nary>
-          <m:r>
-            <m:t> </m:t>
-          </m:r>
           <m:sSub>
             <m:e>
               <m:r>
@@ -24024,9 +24629,6 @@
               </m:sSub>
             </m:e>
           </m:nary>
-          <m:r>
-            <m:t> </m:t>
-          </m:r>
           <m:sSub>
             <m:e>
               <m:r>
@@ -24092,9 +24694,6 @@
               </m:r>
             </m:lim>
           </m:limLow>
-          <m:r>
-            <m:t> </m:t>
-          </m:r>
           <m:r>
             <m:rPr>
               <m:sty m:val="p"/>
@@ -24205,16 +24804,10 @@
             </m:e>
           </m:nary>
           <m:r>
-            <m:t> </m:t>
-          </m:r>
-          <m:r>
             <m:rPr>
               <m:sty m:val="p"/>
             </m:rPr>
             <m:t>+</m:t>
-          </m:r>
-          <m:r>
-            <m:t> </m:t>
           </m:r>
           <m:nary>
             <m:naryPr>
@@ -24263,16 +24856,10 @@
             </m:e>
           </m:nary>
           <m:r>
-            <m:t> </m:t>
-          </m:r>
-          <m:r>
             <m:rPr>
               <m:sty m:val="p"/>
             </m:rPr>
             <m:t>−</m:t>
-          </m:r>
-          <m:r>
-            <m:t> </m:t>
           </m:r>
           <m:r>
             <m:t>2</m:t>
@@ -24330,9 +24917,6 @@
               </m:sSub>
             </m:e>
           </m:nary>
-          <m:r>
-            <m:t> </m:t>
-          </m:r>
           <m:sSub>
             <m:e>
               <m:r>
@@ -24943,9 +25527,6 @@
         </m:r>
         <m:r>
           <m:t>K</m:t>
-        </m:r>
-        <m:r>
-          <m:t> </m:t>
         </m:r>
         <m:r>
           <m:t>n</m:t>

</xml_diff>

<commit_message>
docx: match LaTeX paper fonts, running header, page numbering
- Created a custom reference.docx template with:
  - Times New Roman body font (matching LaTeX serif)
  - Helvetica heading font (matching LaTeX \sffamily)
  - Running header: "NMR 2-D HSQC sort-match SSL" left,
    "final paper, April 2026" right, with bottom rule
  - Page footer: "N / total" centered (matching LaTeX fancyhdr)

- Updated prepare_jcheminf_docx.py:
  - Uses --reference-doc to apply the custom template
  - Removed --number-sections (Abstract was getting numbered "1")
  - Author/affiliation block uses pandoc metadata with superscripts
  - Removed spurious "See structured abstract" placeholder

Verified internals: 14 Word tables, 108 OMML math blocks,
4 embedded PNG figures, header/footer XML present in the docx
archive.

Co-Authored-By: Claude Opus 4.6 (1M context) <noreply@anthropic.com>
</commit_message>
<xml_diff>
--- a/docs/paper_final/manuscript.docx
+++ b/docs/paper_final/manuscript.docx
@@ -12,24 +12,40 @@
       <w:r>
         <w:t xml:space="preserve"> </w:t>
       </w:r>
-      <w:r>
-        <w:rPr>
-          <w:vertAlign w:val="superscript"/>
-        </w:rPr>
-        <w:t xml:space="preserve">1</w:t>
-      </w:r>
+      <m:oMath>
+        <m:sSup>
+          <m:e>
+            <m:r>
+              <m:t>​</m:t>
+            </m:r>
+          </m:e>
+          <m:sup>
+            <m:r>
+              <m:t>1</m:t>
+            </m:r>
+          </m:sup>
+        </m:sSup>
+      </m:oMath>
       <w:r>
         <w:t xml:space="preserve">H and</w:t>
       </w:r>
       <w:r>
         <w:t xml:space="preserve"> </w:t>
       </w:r>
-      <w:r>
-        <w:rPr>
-          <w:vertAlign w:val="superscript"/>
-        </w:rPr>
-        <w:t xml:space="preserve">13</w:t>
-      </w:r>
+      <m:oMath>
+        <m:sSup>
+          <m:e>
+            <m:r>
+              <m:t>​</m:t>
+            </m:r>
+          </m:e>
+          <m:sup>
+            <m:r>
+              <m:t>13</m:t>
+            </m:r>
+          </m:sup>
+        </m:sSup>
+      </m:oMath>
       <w:r>
         <w:t xml:space="preserve">C NMR chemical shifts jointly</w:t>
       </w:r>
@@ -60,22 +76,6 @@
       </w:pPr>
       <w:r>
         <w:t xml:space="preserve">April 2026</w:t>
-      </w:r>
-    </w:p>
-    <w:p>
-      <w:pPr>
-        <w:pStyle w:val="AbstractTitle"/>
-      </w:pPr>
-      <w:r>
-        <w:t xml:space="preserve">Abstract</w:t>
-      </w:r>
-    </w:p>
-    <w:p>
-      <w:pPr>
-        <w:pStyle w:val="Abstract"/>
-      </w:pPr>
-      <w:r>
-        <w:t xml:space="preserve">See structured abstract in the manuscript body.</w:t>
       </w:r>
     </w:p>
     <w:bookmarkStart w:id="9" w:name="abstract"/>
@@ -83,15 +83,6 @@
       <w:pPr>
         <w:pStyle w:val="Heading1"/>
       </w:pPr>
-      <w:r>
-        <w:rPr>
-          <w:rStyle w:val="SectionNumber"/>
-        </w:rPr>
-        <w:t xml:space="preserve">1</w:t>
-      </w:r>
-      <w:r>
-        <w:tab/>
-      </w:r>
       <w:r>
         <w:t xml:space="preserve">Abstract</w:t>
       </w:r>
@@ -1577,15 +1568,6 @@
         <w:pStyle w:val="Heading1"/>
       </w:pPr>
       <w:r>
-        <w:rPr>
-          <w:rStyle w:val="SectionNumber"/>
-        </w:rPr>
-        <w:t xml:space="preserve">2</w:t>
-      </w:r>
-      <w:r>
-        <w:tab/>
-      </w:r>
-      <w:r>
         <w:t xml:space="preserve">Background</w:t>
       </w:r>
     </w:p>
@@ -1892,15 +1874,6 @@
       <w:pPr>
         <w:pStyle w:val="Heading2"/>
       </w:pPr>
-      <w:r>
-        <w:rPr>
-          <w:rStyle w:val="SectionNumber"/>
-        </w:rPr>
-        <w:t xml:space="preserve">2.1</w:t>
-      </w:r>
-      <w:r>
-        <w:tab/>
-      </w:r>
       <w:r>
         <w:t xml:space="preserve">Related work and contributions of this paper</w:t>
       </w:r>
@@ -3066,15 +3039,6 @@
         <w:pStyle w:val="Heading1"/>
       </w:pPr>
       <w:r>
-        <w:rPr>
-          <w:rStyle w:val="SectionNumber"/>
-        </w:rPr>
-        <w:t xml:space="preserve">3</w:t>
-      </w:r>
-      <w:r>
-        <w:tab/>
-      </w:r>
-      <w:r>
         <w:t xml:space="preserve">Methods</w:t>
       </w:r>
     </w:p>
@@ -3083,15 +3047,6 @@
       <w:pPr>
         <w:pStyle w:val="Heading2"/>
       </w:pPr>
-      <w:r>
-        <w:rPr>
-          <w:rStyle w:val="SectionNumber"/>
-        </w:rPr>
-        <w:t xml:space="preserve">3.1</w:t>
-      </w:r>
-      <w:r>
-        <w:tab/>
-      </w:r>
       <w:r>
         <w:t xml:space="preserve">Set-valued NMR supervision</w:t>
       </w:r>
@@ -3786,15 +3741,6 @@
       <w:pPr>
         <w:pStyle w:val="Heading2"/>
       </w:pPr>
-      <w:r>
-        <w:rPr>
-          <w:rStyle w:val="SectionNumber"/>
-        </w:rPr>
-        <w:t xml:space="preserve">3.2</w:t>
-      </w:r>
-      <w:r>
-        <w:tab/>
-      </w:r>
       <w:r>
         <w:t xml:space="preserve">Sliced approximation</w:t>
       </w:r>
@@ -4954,15 +4900,6 @@
         <w:pStyle w:val="Heading2"/>
       </w:pPr>
       <w:r>
-        <w:rPr>
-          <w:rStyle w:val="SectionNumber"/>
-        </w:rPr>
-        <w:t xml:space="preserve">3.3</w:t>
-      </w:r>
-      <w:r>
-        <w:tab/>
-      </w:r>
-      <w:r>
         <w:t xml:space="preserve">Axis-aligned decomposition</w:t>
       </w:r>
     </w:p>
@@ -5222,15 +5159,6 @@
       <w:pPr>
         <w:pStyle w:val="Heading2"/>
       </w:pPr>
-      <w:r>
-        <w:rPr>
-          <w:rStyle w:val="SectionNumber"/>
-        </w:rPr>
-        <w:t xml:space="preserve">3.4</w:t>
-      </w:r>
-      <w:r>
-        <w:tab/>
-      </w:r>
       <w:r>
         <w:t xml:space="preserve">Full training objective</w:t>
       </w:r>
@@ -5965,15 +5893,6 @@
         <w:pStyle w:val="Heading1"/>
       </w:pPr>
       <w:r>
-        <w:rPr>
-          <w:rStyle w:val="SectionNumber"/>
-        </w:rPr>
-        <w:t xml:space="preserve">4</w:t>
-      </w:r>
-      <w:r>
-        <w:tab/>
-      </w:r>
-      <w:r>
         <w:t xml:space="preserve">Experimental details</w:t>
       </w:r>
     </w:p>
@@ -5982,15 +5901,6 @@
       <w:pPr>
         <w:pStyle w:val="Heading2"/>
       </w:pPr>
-      <w:r>
-        <w:rPr>
-          <w:rStyle w:val="SectionNumber"/>
-        </w:rPr>
-        <w:t xml:space="preserve">4.1</w:t>
-      </w:r>
-      <w:r>
-        <w:tab/>
-      </w:r>
       <w:r>
         <w:t xml:space="preserve">Dataset construction</w:t>
       </w:r>
@@ -6300,15 +6210,6 @@
         <w:pStyle w:val="Heading2"/>
       </w:pPr>
       <w:r>
-        <w:rPr>
-          <w:rStyle w:val="SectionNumber"/>
-        </w:rPr>
-        <w:t xml:space="preserve">4.2</w:t>
-      </w:r>
-      <w:r>
-        <w:tab/>
-      </w:r>
-      <w:r>
         <w:t xml:space="preserve">Model</w:t>
       </w:r>
     </w:p>
@@ -6409,15 +6310,6 @@
         <w:pStyle w:val="Heading2"/>
       </w:pPr>
       <w:r>
-        <w:rPr>
-          <w:rStyle w:val="SectionNumber"/>
-        </w:rPr>
-        <w:t xml:space="preserve">4.3</w:t>
-      </w:r>
-      <w:r>
-        <w:tab/>
-      </w:r>
-      <w:r>
         <w:t xml:space="preserve">Sliced sort-match loss</w:t>
       </w:r>
     </w:p>
@@ -6649,15 +6541,6 @@
         <w:pStyle w:val="Heading2"/>
       </w:pPr>
       <w:r>
-        <w:rPr>
-          <w:rStyle w:val="SectionNumber"/>
-        </w:rPr>
-        <w:t xml:space="preserve">4.4</w:t>
-      </w:r>
-      <w:r>
-        <w:tab/>
-      </w:r>
-      <w:r>
         <w:t xml:space="preserve">Training protocol</w:t>
       </w:r>
     </w:p>
@@ -6905,15 +6788,6 @@
         <w:pStyle w:val="Heading2"/>
       </w:pPr>
       <w:r>
-        <w:rPr>
-          <w:rStyle w:val="SectionNumber"/>
-        </w:rPr>
-        <w:t xml:space="preserve">4.5</w:t>
-      </w:r>
-      <w:r>
-        <w:tab/>
-      </w:r>
-      <w:r>
         <w:t xml:space="preserve">Split-conformal calibration</w:t>
       </w:r>
     </w:p>
@@ -7462,15 +7336,6 @@
       <w:pPr>
         <w:pStyle w:val="Heading2"/>
       </w:pPr>
-      <w:r>
-        <w:rPr>
-          <w:rStyle w:val="SectionNumber"/>
-        </w:rPr>
-        <w:t xml:space="preserve">4.6</w:t>
-      </w:r>
-      <w:r>
-        <w:tab/>
-      </w:r>
       <w:r>
         <w:t xml:space="preserve">Structure-verification protocol</w:t>
       </w:r>
@@ -7747,15 +7612,6 @@
         <w:pStyle w:val="Heading1"/>
       </w:pPr>
       <w:r>
-        <w:rPr>
-          <w:rStyle w:val="SectionNumber"/>
-        </w:rPr>
-        <w:t xml:space="preserve">5</w:t>
-      </w:r>
-      <w:r>
-        <w:tab/>
-      </w:r>
-      <w:r>
         <w:t xml:space="preserve">Results</w:t>
       </w:r>
     </w:p>
@@ -7899,15 +7755,6 @@
       <w:pPr>
         <w:pStyle w:val="Heading2"/>
       </w:pPr>
-      <w:r>
-        <w:rPr>
-          <w:rStyle w:val="SectionNumber"/>
-        </w:rPr>
-        <w:t xml:space="preserve">5.1</w:t>
-      </w:r>
-      <w:r>
-        <w:tab/>
-      </w:r>
       <w:r>
         <w:t xml:space="preserve">Main result</w:t>
       </w:r>
@@ -9287,15 +9134,6 @@
         <w:pStyle w:val="Heading2"/>
       </w:pPr>
       <w:r>
-        <w:rPr>
-          <w:rStyle w:val="SectionNumber"/>
-        </w:rPr>
-        <w:t xml:space="preserve">5.2</w:t>
-      </w:r>
-      <w:r>
-        <w:tab/>
-      </w:r>
-      <w:r>
         <w:t xml:space="preserve">Causal audit: the</w:t>
       </w:r>
       <w:r>
@@ -10241,15 +10079,6 @@
         <w:pStyle w:val="Heading2"/>
       </w:pPr>
       <w:r>
-        <w:rPr>
-          <w:rStyle w:val="SectionNumber"/>
-        </w:rPr>
-        <w:t xml:space="preserve">5.3</w:t>
-      </w:r>
-      <w:r>
-        <w:tab/>
-      </w:r>
-      <w:r>
         <w:t xml:space="preserve">Combined supervision and the full-label regime</w:t>
       </w:r>
     </w:p>
@@ -10475,15 +10304,6 @@
       <w:pPr>
         <w:pStyle w:val="Heading2"/>
       </w:pPr>
-      <w:r>
-        <w:rPr>
-          <w:rStyle w:val="SectionNumber"/>
-        </w:rPr>
-        <w:t xml:space="preserve">5.4</w:t>
-      </w:r>
-      <w:r>
-        <w:tab/>
-      </w:r>
       <w:r>
         <w:t xml:space="preserve">Label-efficiency curve</w:t>
       </w:r>
@@ -11156,15 +10976,6 @@
       <w:pPr>
         <w:pStyle w:val="Heading2"/>
       </w:pPr>
-      <w:r>
-        <w:rPr>
-          <w:rStyle w:val="SectionNumber"/>
-        </w:rPr>
-        <w:t xml:space="preserve">5.5</w:t>
-      </w:r>
-      <w:r>
-        <w:tab/>
-      </w:r>
       <w:r>
         <w:t xml:space="preserve">Wrong-candidate discrimination and the dereplication ranker</w:t>
       </w:r>
@@ -11815,15 +11626,6 @@
       <w:pPr>
         <w:pStyle w:val="Heading2"/>
       </w:pPr>
-      <w:r>
-        <w:rPr>
-          <w:rStyle w:val="SectionNumber"/>
-        </w:rPr>
-        <w:t xml:space="preserve">5.6</w:t>
-      </w:r>
-      <w:r>
-        <w:tab/>
-      </w:r>
       <w:r>
         <w:t xml:space="preserve">Scaffold-OOD generalization</w:t>
       </w:r>
@@ -12278,15 +12080,6 @@
         <w:pStyle w:val="Heading2"/>
       </w:pPr>
       <w:r>
-        <w:rPr>
-          <w:rStyle w:val="SectionNumber"/>
-        </w:rPr>
-        <w:t xml:space="preserve">5.7</w:t>
-      </w:r>
-      <w:r>
-        <w:tab/>
-      </w:r>
-      <w:r>
         <w:t xml:space="preserve">Robustness to realistic HSQC degradation</w:t>
       </w:r>
     </w:p>
@@ -12952,15 +12745,6 @@
         <w:pStyle w:val="Heading2"/>
       </w:pPr>
       <w:r>
-        <w:rPr>
-          <w:rStyle w:val="SectionNumber"/>
-        </w:rPr>
-        <w:t xml:space="preserve">5.8</w:t>
-      </w:r>
-      <w:r>
-        <w:tab/>
-      </w:r>
-      <w:r>
         <w:t xml:space="preserve">Hyperparameter sensitivity (</w:t>
       </w:r>
       <m:oMath>
@@ -13939,15 +13723,6 @@
       <w:pPr>
         <w:pStyle w:val="Heading2"/>
       </w:pPr>
-      <w:r>
-        <w:rPr>
-          <w:rStyle w:val="SectionNumber"/>
-        </w:rPr>
-        <w:t xml:space="preserve">5.9</w:t>
-      </w:r>
-      <w:r>
-        <w:tab/>
-      </w:r>
       <w:r>
         <w:t xml:space="preserve">Per-carbon-type error decomposition</w:t>
       </w:r>
@@ -14601,15 +14376,6 @@
       <w:pPr>
         <w:pStyle w:val="Heading2"/>
       </w:pPr>
-      <w:r>
-        <w:rPr>
-          <w:rStyle w:val="SectionNumber"/>
-        </w:rPr>
-        <w:t xml:space="preserve">5.10</w:t>
-      </w:r>
-      <w:r>
-        <w:tab/>
-      </w:r>
       <w:r>
         <w:t xml:space="preserve">Split-conformal calibration and the molecule-level coverage question</w:t>
       </w:r>
@@ -15949,15 +15715,6 @@
         <w:pStyle w:val="Heading1"/>
       </w:pPr>
       <w:r>
-        <w:rPr>
-          <w:rStyle w:val="SectionNumber"/>
-        </w:rPr>
-        <w:t xml:space="preserve">6</w:t>
-      </w:r>
-      <w:r>
-        <w:tab/>
-      </w:r>
-      <w:r>
         <w:t xml:space="preserve">Discussion</w:t>
       </w:r>
     </w:p>
@@ -15966,15 +15723,6 @@
       <w:pPr>
         <w:pStyle w:val="Heading2"/>
       </w:pPr>
-      <w:r>
-        <w:rPr>
-          <w:rStyle w:val="SectionNumber"/>
-        </w:rPr>
-        <w:t xml:space="preserve">6.1</w:t>
-      </w:r>
-      <w:r>
-        <w:tab/>
-      </w:r>
       <w:r>
         <w:t xml:space="preserve">What the results actually show</w:t>
       </w:r>
@@ -16140,15 +15888,6 @@
         <w:pStyle w:val="Heading2"/>
       </w:pPr>
       <w:r>
-        <w:rPr>
-          <w:rStyle w:val="SectionNumber"/>
-        </w:rPr>
-        <w:t xml:space="preserve">6.2</w:t>
-      </w:r>
-      <w:r>
-        <w:tab/>
-      </w:r>
-      <w:r>
         <w:t xml:space="preserve">Honest reframing of the 2-D structure</w:t>
       </w:r>
     </w:p>
@@ -16376,15 +16115,6 @@
       <w:pPr>
         <w:pStyle w:val="Heading2"/>
       </w:pPr>
-      <w:r>
-        <w:rPr>
-          <w:rStyle w:val="SectionNumber"/>
-        </w:rPr>
-        <w:t xml:space="preserve">6.3</w:t>
-      </w:r>
-      <w:r>
-        <w:tab/>
-      </w:r>
       <w:r>
         <w:t xml:space="preserve">Limitations</w:t>
       </w:r>
@@ -17140,15 +16870,6 @@
         <w:pStyle w:val="Heading2"/>
       </w:pPr>
       <w:r>
-        <w:rPr>
-          <w:rStyle w:val="SectionNumber"/>
-        </w:rPr>
-        <w:t xml:space="preserve">6.4</w:t>
-      </w:r>
-      <w:r>
-        <w:tab/>
-      </w:r>
-      <w:r>
         <w:t xml:space="preserve">Where this sits in the landscape</w:t>
       </w:r>
     </w:p>
@@ -17319,15 +17040,6 @@
         <w:pStyle w:val="Heading1"/>
       </w:pPr>
       <w:r>
-        <w:rPr>
-          <w:rStyle w:val="SectionNumber"/>
-        </w:rPr>
-        <w:t xml:space="preserve">7</w:t>
-      </w:r>
-      <w:r>
-        <w:tab/>
-      </w:r>
-      <w:r>
         <w:t xml:space="preserve">Conclusions</w:t>
       </w:r>
     </w:p>
@@ -18069,15 +17781,6 @@
         <w:pStyle w:val="Heading1"/>
       </w:pPr>
       <w:r>
-        <w:rPr>
-          <w:rStyle w:val="SectionNumber"/>
-        </w:rPr>
-        <w:t xml:space="preserve">8</w:t>
-      </w:r>
-      <w:r>
-        <w:tab/>
-      </w:r>
-      <w:r>
         <w:t xml:space="preserve">Declarations</w:t>
       </w:r>
     </w:p>
@@ -18086,15 +17789,6 @@
       <w:pPr>
         <w:pStyle w:val="Heading2"/>
       </w:pPr>
-      <w:r>
-        <w:rPr>
-          <w:rStyle w:val="SectionNumber"/>
-        </w:rPr>
-        <w:t xml:space="preserve">8.1</w:t>
-      </w:r>
-      <w:r>
-        <w:tab/>
-      </w:r>
       <w:r>
         <w:t xml:space="preserve">Availability of data and materials</w:t>
       </w:r>
@@ -18217,15 +17911,6 @@
         <w:pStyle w:val="Heading2"/>
       </w:pPr>
       <w:r>
-        <w:rPr>
-          <w:rStyle w:val="SectionNumber"/>
-        </w:rPr>
-        <w:t xml:space="preserve">8.2</w:t>
-      </w:r>
-      <w:r>
-        <w:tab/>
-      </w:r>
-      <w:r>
         <w:t xml:space="preserve">Code availability</w:t>
       </w:r>
     </w:p>
@@ -18445,15 +18130,6 @@
         <w:pStyle w:val="Heading2"/>
       </w:pPr>
       <w:r>
-        <w:rPr>
-          <w:rStyle w:val="SectionNumber"/>
-        </w:rPr>
-        <w:t xml:space="preserve">8.3</w:t>
-      </w:r>
-      <w:r>
-        <w:tab/>
-      </w:r>
-      <w:r>
         <w:t xml:space="preserve">Abbreviations</w:t>
       </w:r>
     </w:p>
@@ -18496,15 +18172,6 @@
         <w:pStyle w:val="Heading2"/>
       </w:pPr>
       <w:r>
-        <w:rPr>
-          <w:rStyle w:val="SectionNumber"/>
-        </w:rPr>
-        <w:t xml:space="preserve">8.4</w:t>
-      </w:r>
-      <w:r>
-        <w:tab/>
-      </w:r>
-      <w:r>
         <w:t xml:space="preserve">Competing interests</w:t>
       </w:r>
     </w:p>
@@ -18523,15 +18190,6 @@
         <w:pStyle w:val="Heading2"/>
       </w:pPr>
       <w:r>
-        <w:rPr>
-          <w:rStyle w:val="SectionNumber"/>
-        </w:rPr>
-        <w:t xml:space="preserve">8.5</w:t>
-      </w:r>
-      <w:r>
-        <w:tab/>
-      </w:r>
-      <w:r>
         <w:t xml:space="preserve">Funding</w:t>
       </w:r>
     </w:p>
@@ -18550,15 +18208,6 @@
         <w:pStyle w:val="Heading2"/>
       </w:pPr>
       <w:r>
-        <w:rPr>
-          <w:rStyle w:val="SectionNumber"/>
-        </w:rPr>
-        <w:t xml:space="preserve">8.6</w:t>
-      </w:r>
-      <w:r>
-        <w:tab/>
-      </w:r>
-      <w:r>
         <w:t xml:space="preserve">Authors’ contributions</w:t>
       </w:r>
     </w:p>
@@ -18601,15 +18250,6 @@
         <w:pStyle w:val="Heading2"/>
       </w:pPr>
       <w:r>
-        <w:rPr>
-          <w:rStyle w:val="SectionNumber"/>
-        </w:rPr>
-        <w:t xml:space="preserve">8.7</w:t>
-      </w:r>
-      <w:r>
-        <w:tab/>
-      </w:r>
-      <w:r>
         <w:t xml:space="preserve">Acknowledgements</w:t>
       </w:r>
     </w:p>
@@ -18716,15 +18356,6 @@
         <w:pStyle w:val="Heading2"/>
       </w:pPr>
       <w:r>
-        <w:rPr>
-          <w:rStyle w:val="SectionNumber"/>
-        </w:rPr>
-        <w:t xml:space="preserve">8.8</w:t>
-      </w:r>
-      <w:r>
-        <w:tab/>
-      </w:r>
-      <w:r>
         <w:t xml:space="preserve">Ethics approval and consent to participate</w:t>
       </w:r>
     </w:p>
@@ -18754,15 +18385,6 @@
       <w:pPr>
         <w:pStyle w:val="Heading2"/>
       </w:pPr>
-      <w:r>
-        <w:rPr>
-          <w:rStyle w:val="SectionNumber"/>
-        </w:rPr>
-        <w:t xml:space="preserve">8.9</w:t>
-      </w:r>
-      <w:r>
-        <w:tab/>
-      </w:r>
       <w:r>
         <w:t xml:space="preserve">Consent for publication</w:t>
       </w:r>
@@ -18783,15 +18405,6 @@
         <w:pStyle w:val="Heading1"/>
       </w:pPr>
       <w:r>
-        <w:rPr>
-          <w:rStyle w:val="SectionNumber"/>
-        </w:rPr>
-        <w:t xml:space="preserve">9</w:t>
-      </w:r>
-      <w:r>
-        <w:tab/>
-      </w:r>
-      <w:r>
         <w:t xml:space="preserve">References</w:t>
       </w:r>
     </w:p>
@@ -19306,15 +18919,6 @@
         <w:pStyle w:val="Heading1"/>
       </w:pPr>
       <w:r>
-        <w:rPr>
-          <w:rStyle w:val="SectionNumber"/>
-        </w:rPr>
-        <w:t xml:space="preserve">10</w:t>
-      </w:r>
-      <w:r>
-        <w:tab/>
-      </w:r>
-      <w:r>
         <w:t xml:space="preserve">Supplementary Information</w:t>
       </w:r>
     </w:p>
@@ -19323,15 +18927,6 @@
       <w:pPr>
         <w:pStyle w:val="Heading2"/>
       </w:pPr>
-      <w:r>
-        <w:rPr>
-          <w:rStyle w:val="SectionNumber"/>
-        </w:rPr>
-        <w:t xml:space="preserve">10.1</w:t>
-      </w:r>
-      <w:r>
-        <w:tab/>
-      </w:r>
       <w:r>
         <w:t xml:space="preserve">S1. Per-seed results for the headline 2-D SSL variant</w:t>
       </w:r>
@@ -19709,15 +19304,6 @@
         <w:pStyle w:val="Heading2"/>
       </w:pPr>
       <w:r>
-        <w:rPr>
-          <w:rStyle w:val="SectionNumber"/>
-        </w:rPr>
-        <w:t xml:space="preserve">10.2</w:t>
-      </w:r>
-      <w:r>
-        <w:tab/>
-      </w:r>
-      <w:r>
         <w:t xml:space="preserve">S2. Per-seed results for the combined full-supervision variant</w:t>
       </w:r>
     </w:p>
@@ -20108,15 +19694,6 @@
         <w:pStyle w:val="Heading2"/>
       </w:pPr>
       <w:r>
-        <w:rPr>
-          <w:rStyle w:val="SectionNumber"/>
-        </w:rPr>
-        <w:t xml:space="preserve">10.3</w:t>
-      </w:r>
-      <w:r>
-        <w:tab/>
-      </w:r>
-      <w:r>
         <w:t xml:space="preserve">S3. Novel (and neutral) multiplicity-augmented loss</w:t>
       </w:r>
     </w:p>
@@ -20593,15 +20170,6 @@
         <w:pStyle w:val="Heading2"/>
       </w:pPr>
       <w:r>
-        <w:rPr>
-          <w:rStyle w:val="SectionNumber"/>
-        </w:rPr>
-        <w:t xml:space="preserve">10.4</w:t>
-      </w:r>
-      <w:r>
-        <w:tab/>
-      </w:r>
-      <w:r>
         <w:t xml:space="preserve">S4. Cross-task gradient isolation (stop-gradient control)</w:t>
       </w:r>
     </w:p>
@@ -21102,15 +20670,6 @@
       <w:pPr>
         <w:pStyle w:val="Heading2"/>
       </w:pPr>
-      <w:r>
-        <w:rPr>
-          <w:rStyle w:val="SectionNumber"/>
-        </w:rPr>
-        <w:t xml:space="preserve">10.5</w:t>
-      </w:r>
-      <w:r>
-        <w:tab/>
-      </w:r>
       <w:r>
         <w:t xml:space="preserve">S5. Pretrain-then-finetune transfer baseline</w:t>
       </w:r>
@@ -21574,15 +21133,6 @@
         <w:pStyle w:val="Heading2"/>
       </w:pPr>
       <w:r>
-        <w:rPr>
-          <w:rStyle w:val="SectionNumber"/>
-        </w:rPr>
-        <w:t xml:space="preserve">10.6</w:t>
-      </w:r>
-      <w:r>
-        <w:tab/>
-      </w:r>
-      <w:r>
         <w:t xml:space="preserve">S6. Stereo-rich natural-product stress test</w:t>
       </w:r>
     </w:p>
@@ -21748,15 +21298,6 @@
         <w:pStyle w:val="Heading2"/>
       </w:pPr>
       <w:r>
-        <w:rPr>
-          <w:rStyle w:val="SectionNumber"/>
-        </w:rPr>
-        <w:t xml:space="preserve">10.7</w:t>
-      </w:r>
-      <w:r>
-        <w:tab/>
-      </w:r>
-      <w:r>
         <w:t xml:space="preserve">S7. Loss-code audit</w:t>
       </w:r>
     </w:p>
@@ -21906,15 +21447,6 @@
       <w:pPr>
         <w:pStyle w:val="Heading2"/>
       </w:pPr>
-      <w:r>
-        <w:rPr>
-          <w:rStyle w:val="SectionNumber"/>
-        </w:rPr>
-        <w:t xml:space="preserve">10.8</w:t>
-      </w:r>
-      <w:r>
-        <w:tab/>
-      </w:r>
       <w:r>
         <w:t xml:space="preserve">S8. Self-contained statement and proof of the 1-D sort-match theorem</w:t>
       </w:r>
@@ -25887,6 +25419,8 @@
       <w:footnotePr>
         <w:numRestart w:val="eachSect"/>
       </w:footnotePr>
+      <w:headerReference r:id="rIdHeader1" w:type="default"/>
+      <w:footerReference r:id="rIdFooter1" w:type="default"/>
     </w:sectPr>
   </w:body>
 </w:document>
@@ -25896,6 +25430,50 @@
 <w:comments xmlns:w="http://schemas.openxmlformats.org/wordprocessingml/2006/main" xmlns:m="http://schemas.openxmlformats.org/officeDocument/2006/math" xmlns:r="http://schemas.openxmlformats.org/officeDocument/2006/relationships" xmlns:o="urn:schemas-microsoft-com:office:office" xmlns:v="urn:schemas-microsoft-com:vml" xmlns:w10="urn:schemas-microsoft-com:office:word" xmlns:a="http://schemas.openxmlformats.org/drawingml/2006/main" xmlns:pic="http://schemas.openxmlformats.org/drawingml/2006/picture" xmlns:wp="http://schemas.openxmlformats.org/drawingml/2006/wordprocessingDrawing"/>
 </file>
 
+<file path=word/footer1.xml><?xml version="1.0" encoding="utf-8"?>
+<w:ftr xmlns:w="http://schemas.openxmlformats.org/wordprocessingml/2006/main">
+  <w:p>
+    <w:pPr>
+      <w:pStyle w:val="Footer"/>
+      <w:jc w:val="center"/>
+    </w:pPr>
+    <w:r>
+      <w:fldChar w:fldCharType="begin"/>
+    </w:r>
+    <w:r>
+      <w:instrText xml:space="preserve"> PAGE </w:instrText>
+    </w:r>
+    <w:r>
+      <w:fldChar w:fldCharType="separate"/>
+    </w:r>
+    <w:r>
+      <w:t>1</w:t>
+    </w:r>
+    <w:r>
+      <w:fldChar w:fldCharType="end"/>
+    </w:r>
+    <w:r>
+      <w:t xml:space="preserve"> / </w:t>
+    </w:r>
+    <w:r>
+      <w:fldChar w:fldCharType="begin"/>
+    </w:r>
+    <w:r>
+      <w:instrText xml:space="preserve"> NUMPAGES </w:instrText>
+    </w:r>
+    <w:r>
+      <w:fldChar w:fldCharType="separate"/>
+    </w:r>
+    <w:r>
+      <w:t>1</w:t>
+    </w:r>
+    <w:r>
+      <w:fldChar w:fldCharType="end"/>
+    </w:r>
+  </w:p>
+</w:ftr>
+</file>
+
 <file path=word/footnotes.xml><?xml version="1.0" encoding="utf-8"?>
 <w:footnotes xmlns:w="http://schemas.openxmlformats.org/wordprocessingml/2006/main" xmlns:m="http://schemas.openxmlformats.org/officeDocument/2006/math" xmlns:r="http://schemas.openxmlformats.org/officeDocument/2006/relationships" xmlns:o="urn:schemas-microsoft-com:office:office" xmlns:v="urn:schemas-microsoft-com:vml" xmlns:w10="urn:schemas-microsoft-com:office:word" xmlns:a="http://schemas.openxmlformats.org/drawingml/2006/main" xmlns:pic="http://schemas.openxmlformats.org/drawingml/2006/picture" xmlns:wp="http://schemas.openxmlformats.org/drawingml/2006/wordprocessingDrawing">
   <w:footnote w:type="continuationSeparator" w:id="0">
@@ -25913,6 +25491,49 @@
     </w:p>
   </w:footnote>
 </w:footnotes>
+</file>
+
+<file path=word/header1.xml><?xml version="1.0" encoding="utf-8"?>
+<w:hdr xmlns:w="http://schemas.openxmlformats.org/wordprocessingml/2006/main" xmlns:r="http://schemas.openxmlformats.org/officeDocument/2006/relationships">
+  <w:p>
+    <w:pPr>
+      <w:pStyle w:val="Header"/>
+      <w:tabs>
+        <w:tab w:val="right" w:pos="9360"/>
+      </w:tabs>
+      <w:pBdr>
+        <w:bottom w:val="single" w:sz="4" w:space="1" w:color="auto"/>
+      </w:pBdr>
+      <w:rPr>
+        <w:sz w:val="16"/>
+        <w:szCs w:val="16"/>
+      </w:rPr>
+    </w:pPr>
+    <w:r>
+      <w:rPr>
+        <w:sz w:val="16"/>
+        <w:szCs w:val="16"/>
+        <w:rFonts w:ascii="Helvetica" w:hAnsi="Helvetica"/>
+      </w:rPr>
+      <w:t>NMR 2-D HSQC sort-match SSL</w:t>
+    </w:r>
+    <w:r>
+      <w:rPr>
+        <w:sz w:val="16"/>
+        <w:szCs w:val="16"/>
+      </w:rPr>
+      <w:tab/>
+    </w:r>
+    <w:r>
+      <w:rPr>
+        <w:sz w:val="16"/>
+        <w:szCs w:val="16"/>
+        <w:rFonts w:ascii="Helvetica" w:hAnsi="Helvetica"/>
+      </w:rPr>
+      <w:t>final paper, April 2026</w:t>
+    </w:r>
+  </w:p>
+</w:hdr>
 </file>
 
 <file path=word/numbering.xml><?xml version="1.0" encoding="utf-8"?>
@@ -27050,7 +26671,7 @@
     </a:clrScheme>
     <a:fontScheme name="Office">
       <a:majorFont>
-        <a:latin typeface="Aptos Display" panose="02110004020202020204"/>
+        <a:latin typeface="Helvetica"/>
         <a:ea typeface=""/>
         <a:cs typeface=""/>
         <a:font script="Jpan" typeface="游ゴシック Light"/>
@@ -27102,7 +26723,7 @@
         <a:font script="Tfng" typeface="Ebrima"/>
       </a:majorFont>
       <a:minorFont>
-        <a:latin typeface="Aptos" panose="02110004020202020204"/>
+        <a:latin typeface="Times New Roman"/>
         <a:ea typeface=""/>
         <a:cs typeface=""/>
         <a:font script="Jpan" typeface="游明朝"/>

</xml_diff>